<commit_message>
Add public repository URL to CRM materials
</commit_message>
<xml_diff>
--- a/manuscript/CRM_MANUSCRIPT_v1.6_FULL.docx
+++ b/manuscript/CRM_MANUSCRIPT_v1.6_FULL.docx
@@ -28,7 +28,7 @@
         <w:spacing w:after="120"/>
       </w:pPr>
       <w:r>
-        <w:t>Generated: 2026-09-01 14:07:50 UTC</w:t>
+        <w:t>Generated: 2026-09-01 14:18:05 UTC</w:t>
       </w:r>
     </w:p>
     <w:p>
@@ -1240,7 +1240,7 @@
         <w:spacing w:after="120"/>
       </w:pPr>
       <w:r>
-        <w:t>Norman perturbation data were used through a GEARS-compatible processed mirror [1,3]. Replogle analyses used GEARS-compatible filtered essential-screen K562 and RPE1 objects; complete Figshare+ processed objects were not part of the frozen analyses [2,10,11]. Derived result tables are stored under results/tables/, and manuscript figures are stored under figures/main/ and figures/supplementary/. Public repository URL and archived code/result DOI remain to be completed before journal submission. Working metadata use [ZENODO_DOI_PENDING] only as a placeholder.</w:t>
+        <w:t>Norman perturbation data were used through a GEARS-compatible processed mirror [1,3]. Replogle analyses used GEARS-compatible filtered essential-screen K562 and RPE1 objects; complete Figshare+ processed objects were not part of the frozen analyses [2,10,11]. Derived result tables are stored under results/tables/, and manuscript figures are stored under figures/main/ and figures/supplementary/. Code and derived manuscript-facing data are available at https://github.com/seefreewind/VirtualPerturb-Audit. The archived code/result DOI remains to be completed before journal submission. Working metadata use [ZENODO_DOI_PENDING] only as a placeholder.</w:t>
       </w:r>
     </w:p>
     <w:p>

</xml_diff>